<commit_message>
docs: incluir datos de transferencia Ficohsa en propuesta
</commit_message>
<xml_diff>
--- a/Propuestas/Formalizacion/Propuesta_Formalizacion_AFP_Occidente_v1.6.docx
+++ b/Propuestas/Formalizacion/Propuesta_Formalizacion_AFP_Occidente_v1.6.docx
@@ -2411,47 +2411,55 @@
         <w:pStyle w:val="Heading2"/>
       </w:pPr>
       <w:r>
-        <w:t>Expediente de contratación</w:t>
+        <w:t>Datos para transferencia bancaria</w:t>
       </w:r>
     </w:p>
     <w:p>
-      <w:pPr>
-        <w:pStyle w:val="ListBullet"/>
-      </w:pPr>
+      <w:pPr/>
       <w:r>
-        <w:t>Razón social completa, RTN, domicilio y representante con facultades suficientes de AFP Occidente.</w:t>
+        <w:rPr>
+          <w:b/>
+        </w:rPr>
+        <w:t xml:space="preserve">Titular: </w:t>
+      </w:r>
+      <w:r>
+        <w:t>MACAO Solutions S de RL</w:t>
       </w:r>
     </w:p>
     <w:p>
-      <w:pPr>
-        <w:pStyle w:val="ListBullet"/>
-      </w:pPr>
+      <w:pPr/>
       <w:r>
-        <w:t>RTN, domicilio, datos registrales y representante de MACAO Solutions S. de R.L.</w:t>
+        <w:rPr>
+          <w:b/>
+        </w:rPr>
+        <w:t xml:space="preserve">Banco: </w:t>
+      </w:r>
+      <w:r>
+        <w:t>Banco Ficohsa</w:t>
       </w:r>
     </w:p>
     <w:p>
-      <w:pPr>
-        <w:pStyle w:val="ListBullet"/>
-      </w:pPr>
+      <w:pPr/>
       <w:r>
-        <w:t>Orden de compra y datos de referencia para la contratación, cuando corresponda.</w:t>
+        <w:rPr>
+          <w:b/>
+        </w:rPr>
+        <w:t xml:space="preserve">Tipo de cuenta: </w:t>
+      </w:r>
+      <w:r>
+        <w:t>Ahorro</w:t>
       </w:r>
     </w:p>
     <w:p>
-      <w:pPr>
-        <w:pStyle w:val="ListBullet"/>
-      </w:pPr>
+      <w:pPr/>
       <w:r>
-        <w:t>Ciudad de las sesiones, responsables y correos autorizados para aprobaciones y notificaciones.</w:t>
+        <w:rPr>
+          <w:b/>
+        </w:rPr>
+        <w:t xml:space="preserve">Número de cuenta: </w:t>
       </w:r>
-    </w:p>
-    <w:p>
-      <w:pPr>
-        <w:pStyle w:val="ListBullet"/>
-      </w:pPr>
       <w:r>
-        <w:t>Calendario real de inicio, datos de facturación y constancia de pagos efectivamente recibidos.</w:t>
+        <w:t>200023565977</w:t>
       </w:r>
     </w:p>
     <w:p>

</xml_diff>

<commit_message>
docs: completar RTN y domicilio de MACAO
</commit_message>
<xml_diff>
--- a/Propuestas/Formalizacion/Propuesta_Formalizacion_AFP_Occidente_v1.6.docx
+++ b/Propuestas/Formalizacion/Propuesta_Formalizacion_AFP_Occidente_v1.6.docx
@@ -2432,6 +2432,30 @@
         <w:rPr>
           <w:b/>
         </w:rPr>
+        <w:t xml:space="preserve">RTN: </w:t>
+      </w:r>
+      <w:r>
+        <w:t>08019025155099</w:t>
+      </w:r>
+    </w:p>
+    <w:p>
+      <w:pPr/>
+      <w:r>
+        <w:rPr>
+          <w:b/>
+        </w:rPr>
+        <w:t xml:space="preserve">Domicilio: </w:t>
+      </w:r>
+      <w:r>
+        <w:t>Residencial Villa Toscana, Bloque D casa 12</w:t>
+      </w:r>
+    </w:p>
+    <w:p>
+      <w:pPr/>
+      <w:r>
+        <w:rPr>
+          <w:b/>
+        </w:rPr>
         <w:t xml:space="preserve">Banco: </w:t>
       </w:r>
       <w:r>

</xml_diff>